<commit_message>
Upgrade portfolio credentials and resumes
</commit_message>
<xml_diff>
--- a/docs/generated/karthik_ats_resume.docx
+++ b/docs/generated/karthik_ats_resume.docx
@@ -88,7 +88,7 @@
           <w:color w:val="111827"/>
           <w:sz w:val="20"/>
         </w:rPr>
-        <w:t>- Languages: Python, JavaScript, HTML, CSS, TypeScript basics</w:t>
+        <w:t>- Languages: Python, JavaScript, HTML, CSS, C, TypeScript basics</w:t>
       </w:r>
     </w:p>
     <w:p>
@@ -102,7 +102,7 @@
           <w:color w:val="111827"/>
           <w:sz w:val="20"/>
         </w:rPr>
-        <w:t>- Frontend and data: React, Vite, Supabase, ReportLab, python-docx, Django basics</w:t>
+        <w:t>- Frontend and data: React, Vite, Supabase, ReportLab, python-docx, data analysis, data structures, Django basics</w:t>
       </w:r>
     </w:p>
     <w:p>
@@ -116,7 +116,57 @@
           <w:color w:val="111827"/>
           <w:sz w:val="20"/>
         </w:rPr>
-        <w:t>- Tools and areas: Git, GitHub, GitHub Actions, VS Code, CLI tools, AI-assisted development with manual verification, REST API basics, PostgreSQL basics, ERP workflows, dashboards, testing, documentation, Docker basics, GSAP basics, Framer Motion basics</w:t>
+        <w:t>- Tools and areas: Git, GitHub, GitHub Actions, VS Code, CLI tools, AI-assisted development with manual verification, REST API basics, PostgreSQL basics, ERP workflows, dashboards, testing, documentation, cloud fundamentals, Docker basics, GSAP basics, Framer Motion basics</w:t>
+      </w:r>
+    </w:p>
+    <w:p>
+      <w:pPr>
+        <w:pStyle w:val="Heading1"/>
+      </w:pPr>
+      <w:r>
+        <w:t>Course Credentials</w:t>
+      </w:r>
+    </w:p>
+    <w:p>
+      <w:pPr>
+        <w:spacing w:after="40"/>
+        <w:ind w:left="317" w:hanging="173"/>
+      </w:pPr>
+      <w:r>
+        <w:rPr>
+          <w:rFonts w:ascii="Arial" w:hAnsi="Arial" w:eastAsia="Arial"/>
+          <w:color w:val="111827"/>
+          <w:sz w:val="20"/>
+        </w:rPr>
+        <w:t>- AI and ML: Machine Learning Specialization; Neural Networks and Deep Learning; Convolutional Neural Networks; NLP with Attention Models; Generative AI; GANs.</w:t>
+      </w:r>
+    </w:p>
+    <w:p>
+      <w:pPr>
+        <w:spacing w:after="40"/>
+        <w:ind w:left="317" w:hanging="173"/>
+      </w:pPr>
+      <w:r>
+        <w:rPr>
+          <w:rFonts w:ascii="Arial" w:hAnsi="Arial" w:eastAsia="Arial"/>
+          <w:color w:val="111827"/>
+          <w:sz w:val="20"/>
+        </w:rPr>
+        <w:t>- Cloud and security: Microsoft Azure Fundamentals (AZ-900) Cert Prep; Google Cloud Digital Leader Certification Prep; AWS Cloud Practitioner Essentials; IBM Cybersecurity Essentials.</w:t>
+      </w:r>
+    </w:p>
+    <w:p>
+      <w:pPr>
+        <w:spacing w:after="40"/>
+        <w:ind w:left="317" w:hanging="173"/>
+      </w:pPr>
+      <w:r>
+        <w:rPr>
+          <w:rFonts w:ascii="Arial" w:hAnsi="Arial" w:eastAsia="Arial"/>
+          <w:color w:val="111827"/>
+          <w:sz w:val="20"/>
+        </w:rPr>
+        <w:t>- Software and data: Front-End Development; Python; Data Structures in C; Programming with C; Data Analysis with Python; cloud computing. Full 23-course archive: portfolio link.</w:t>
       </w:r>
     </w:p>
     <w:p>
@@ -287,42 +337,6 @@
           <w:sz w:val="20"/>
         </w:rPr>
         <w:t>- Relevant coursework: Artificial Intelligence, Programming, Data Structures, Web Development, Database Systems</w:t>
-      </w:r>
-    </w:p>
-    <w:p>
-      <w:pPr>
-        <w:pStyle w:val="Heading1"/>
-      </w:pPr>
-      <w:r>
-        <w:t>Additional</w:t>
-      </w:r>
-    </w:p>
-    <w:p>
-      <w:pPr>
-        <w:spacing w:after="40"/>
-        <w:ind w:left="317" w:hanging="173"/>
-      </w:pPr>
-      <w:r>
-        <w:rPr>
-          <w:rFonts w:ascii="Arial" w:hAnsi="Arial" w:eastAsia="Arial"/>
-          <w:color w:val="111827"/>
-          <w:sz w:val="20"/>
-        </w:rPr>
-        <w:t>- Availability: Immediate; remote internships, freelance work, part-time developer roles, contract projects around college schedule</w:t>
-      </w:r>
-    </w:p>
-    <w:p>
-      <w:pPr>
-        <w:spacing w:after="40"/>
-        <w:ind w:left="317" w:hanging="173"/>
-      </w:pPr>
-      <w:r>
-        <w:rPr>
-          <w:rFonts w:ascii="Arial" w:hAnsi="Arial" w:eastAsia="Arial"/>
-          <w:color w:val="111827"/>
-          <w:sz w:val="20"/>
-        </w:rPr>
-        <w:t>- Languages: English, Tamil</w:t>
       </w:r>
     </w:p>
     <w:sectPr>

</xml_diff>

<commit_message>
feat: complete portfolio labs resumes and Cloudflare release
</commit_message>
<xml_diff>
--- a/docs/generated/karthik_ats_resume.docx
+++ b/docs/generated/karthik_ats_resume.docx
@@ -11,8 +11,8 @@
         <w:rPr>
           <w:rFonts w:ascii="Arial" w:hAnsi="Arial" w:eastAsia="Arial"/>
           <w:b/>
-          <w:color w:val="111827"/>
-          <w:sz w:val="40"/>
+          <w:color w:val="171713"/>
+          <w:sz w:val="38"/>
         </w:rPr>
         <w:t>Deepan Karthick</w:t>
       </w:r>
@@ -26,10 +26,10 @@
         <w:rPr>
           <w:rFonts w:ascii="Arial" w:hAnsi="Arial" w:eastAsia="Arial"/>
           <w:b w:val="0"/>
-          <w:color w:val="0F766E"/>
+          <w:color w:val="1E4A37"/>
           <w:sz w:val="21"/>
         </w:rPr>
-        <w:t>B.Sc. CS (AI) Student | AI Automation Developer | React | Python</w:t>
+        <w:t>B.Sc. CS (AI) Student | React &amp; Python | Business Software | Applied AI</w:t>
       </w:r>
     </w:p>
     <w:p>
@@ -42,9 +42,9 @@
           <w:rFonts w:ascii="Arial" w:hAnsi="Arial" w:eastAsia="Arial"/>
           <w:b w:val="0"/>
           <w:color w:val="4B5563"/>
-          <w:sz w:val="17"/>
+          <w:sz w:val="16"/>
         </w:rPr>
-        <w:t>deepankarthick212@gmail.com | 9487572163 | Coimbatore, Tamil Nadu, India | GitHub: https://github.com/darkraigamer212-cmd/career-application-kit | LinkedIn: https://www.linkedin.com/in/deepan-karthick-166735374/ | Portfolio: https://darkraigamer212-cmd.github.io/career-application-kit/portfolio/</w:t>
+        <w:t>deepankarthick212@gmail.com | 9487572163 | Coimbatore, Tamil Nadu, India | GitHub: https://github.com/darkraigamer212-cmd | LinkedIn: https://www.linkedin.com/in/deepan-karthick-166735374/ | Portfolio: https://deepan-karthick-portfolio.industrious-keyboard.workers.dev/</w:t>
       </w:r>
     </w:p>
     <w:p>
@@ -66,7 +66,7 @@
           <w:color w:val="111827"/>
           <w:sz w:val="20"/>
         </w:rPr>
-        <w:t>Computer Science with Artificial Intelligence student building Python automation tools, React dashboards, ERP-style workflows, and PDF/DOCX report generators. Strongest proof: rental research automation with filtering/scoring logic, offline sample data, generated reports, and unit tests.</w:t>
+        <w:t>Computer Science with Artificial Intelligence student building practical React and JavaScript software for local-business workflows plus defensive, local-first AI, data, cloud, and cybersecurity prototypes. Delivered two working flagship products and a 30-project Applied Labs catalog supported by 142 lab-focused tests; the full repository suite passes 151 tests. Seeking software engineering internships and startup-project opportunities.</w:t>
       </w:r>
     </w:p>
     <w:p>
@@ -79,44 +79,41 @@
     </w:p>
     <w:p>
       <w:pPr>
-        <w:spacing w:after="40"/>
-        <w:ind w:left="317" w:hanging="173"/>
+        <w:pStyle w:val="ListBullet"/>
       </w:pPr>
       <w:r>
         <w:rPr>
           <w:rFonts w:ascii="Arial" w:hAnsi="Arial" w:eastAsia="Arial"/>
           <w:color w:val="111827"/>
-          <w:sz w:val="20"/>
+          <w:sz w:val="18"/>
         </w:rPr>
-        <w:t>- Languages: Python, JavaScript, HTML, CSS, C, TypeScript basics</w:t>
+        <w:t>Languages: Python, JavaScript, C, HTML, CSS; TypeScript basics</w:t>
       </w:r>
     </w:p>
     <w:p>
       <w:pPr>
-        <w:spacing w:after="40"/>
-        <w:ind w:left="317" w:hanging="173"/>
+        <w:pStyle w:val="ListBullet"/>
       </w:pPr>
       <w:r>
         <w:rPr>
           <w:rFonts w:ascii="Arial" w:hAnsi="Arial" w:eastAsia="Arial"/>
           <w:color w:val="111827"/>
-          <w:sz w:val="20"/>
+          <w:sz w:val="18"/>
         </w:rPr>
-        <w:t>- Frontend and data: React, Vite, Supabase, ReportLab, python-docx, data analysis, data structures, Django basics</w:t>
+        <w:t>Applications and data: React, Vite, responsive UI, dashboards, JSON/CSV validation, data analysis, local-first workflows, PDF/DOCX generation</w:t>
       </w:r>
     </w:p>
     <w:p>
       <w:pPr>
-        <w:spacing w:after="40"/>
-        <w:ind w:left="317" w:hanging="173"/>
+        <w:pStyle w:val="ListBullet"/>
       </w:pPr>
       <w:r>
         <w:rPr>
           <w:rFonts w:ascii="Arial" w:hAnsi="Arial" w:eastAsia="Arial"/>
           <w:color w:val="111827"/>
-          <w:sz w:val="20"/>
+          <w:sz w:val="18"/>
         </w:rPr>
-        <w:t>- Tools and areas: Git, GitHub, GitHub Actions, VS Code, CLI tools, AI-assisted development with manual verification, REST API basics, PostgreSQL basics, ERP workflows, dashboards, testing, documentation, cloud fundamentals, Docker basics, GSAP basics, Framer Motion basics</w:t>
+        <w:t>Engineering: Git, GitHub, automated testing, CI workflows, defensive input validation, REST API basics, Supabase/PostgreSQL basics, cloud/networking fundamentals, technical documentation, AI-assisted development with manual verification</w:t>
       </w:r>
     </w:p>
     <w:p>
@@ -124,49 +121,20 @@
         <w:pStyle w:val="Heading1"/>
       </w:pPr>
       <w:r>
-        <w:t>Course Credentials</w:t>
+        <w:t>Credentials</w:t>
       </w:r>
     </w:p>
     <w:p>
       <w:pPr>
-        <w:spacing w:after="40"/>
-        <w:ind w:left="317" w:hanging="173"/>
+        <w:pStyle w:val="ListBullet"/>
       </w:pPr>
       <w:r>
         <w:rPr>
           <w:rFonts w:ascii="Arial" w:hAnsi="Arial" w:eastAsia="Arial"/>
           <w:color w:val="111827"/>
-          <w:sz w:val="20"/>
+          <w:sz w:val="18"/>
         </w:rPr>
-        <w:t>- AI and ML: Machine Learning Specialization; Neural Networks and Deep Learning; Convolutional Neural Networks; NLP with Attention Models; Generative AI; GANs.</w:t>
-      </w:r>
-    </w:p>
-    <w:p>
-      <w:pPr>
-        <w:spacing w:after="40"/>
-        <w:ind w:left="317" w:hanging="173"/>
-      </w:pPr>
-      <w:r>
-        <w:rPr>
-          <w:rFonts w:ascii="Arial" w:hAnsi="Arial" w:eastAsia="Arial"/>
-          <w:color w:val="111827"/>
-          <w:sz w:val="20"/>
-        </w:rPr>
-        <w:t>- Cloud and security: Microsoft Azure Fundamentals (AZ-900) Cert Prep; Google Cloud Digital Leader Certification Prep; AWS Cloud Practitioner Essentials; IBM Cybersecurity Essentials.</w:t>
-      </w:r>
-    </w:p>
-    <w:p>
-      <w:pPr>
-        <w:spacing w:after="40"/>
-        <w:ind w:left="317" w:hanging="173"/>
-      </w:pPr>
-      <w:r>
-        <w:rPr>
-          <w:rFonts w:ascii="Arial" w:hAnsi="Arial" w:eastAsia="Arial"/>
-          <w:color w:val="111827"/>
-          <w:sz w:val="20"/>
-        </w:rPr>
-        <w:t>- Software and data: Front-End Development; Python; Data Structures in C; Programming with C; Data Analysis with Python; cloud computing. Full 23-course archive: portfolio link.</w:t>
+        <w:t>30 completed credentials across machine learning, generative AI, cloud, networking, programming, data analysis, business, and cybersecurity; certificate archive and working prototypes are linked from the portfolio.</w:t>
       </w:r>
     </w:p>
     <w:p>
@@ -188,49 +156,33 @@
           <w:color w:val="111827"/>
           <w:sz w:val="20"/>
         </w:rPr>
-        <w:t>Rental Research Report Generator | Python, ReportLab, python-docx, JSON</w:t>
+        <w:t>Printing Press ERP | React, TypeScript/JavaScript, Vite, Supabase-compatible architecture</w:t>
       </w:r>
     </w:p>
     <w:p>
       <w:pPr>
-        <w:spacing w:after="40"/>
-        <w:ind w:left="317" w:hanging="173"/>
+        <w:pStyle w:val="ListBullet"/>
       </w:pPr>
       <w:r>
         <w:rPr>
           <w:rFonts w:ascii="Arial" w:hAnsi="Arial" w:eastAsia="Arial"/>
           <w:color w:val="111827"/>
-          <w:sz w:val="20"/>
+          <w:sz w:val="18"/>
         </w:rPr>
-        <w:t>- Built a Python automation workflow that normalizes rental listing data, filters unsuitable options, ranks matches, and generates PDF/DOCX decision reports.</w:t>
+        <w:t>Repaired and deployed a synthetic public demo with owner dashboards, browser-local order/production workflows, persistence, route navigation, and production-priority updates while isolating live client data and authentication.</w:t>
       </w:r>
     </w:p>
     <w:p>
       <w:pPr>
-        <w:spacing w:after="40"/>
-        <w:ind w:left="317" w:hanging="173"/>
+        <w:pStyle w:val="ListBullet"/>
       </w:pPr>
       <w:r>
         <w:rPr>
           <w:rFonts w:ascii="Arial" w:hAnsi="Arial" w:eastAsia="Arial"/>
           <w:color w:val="111827"/>
-          <w:sz w:val="20"/>
+          <w:sz w:val="18"/>
         </w:rPr>
-        <w:t>- Implemented scoring/filters for rent range, listing type, commute distance, furnishing, deposit practicality, and unsuitable categories.</w:t>
-      </w:r>
-    </w:p>
-    <w:p>
-      <w:pPr>
-        <w:spacing w:after="40"/>
-        <w:ind w:left="317" w:hanging="173"/>
-      </w:pPr>
-      <w:r>
-        <w:rPr>
-          <w:rFonts w:ascii="Arial" w:hAnsi="Arial" w:eastAsia="Arial"/>
-          <w:color w:val="111827"/>
-          <w:sz w:val="20"/>
-        </w:rPr>
-        <w:t>- Generated English/Tamil outputs with ranked properties, budgets, verification checklist, source links, offline sample data, and unit tests.</w:t>
+        <w:t>Verified runtime/store behavior, dashboard routes, SPA deep links, lint, production build, persistence, and a Cloudflare Workers deployment.</w:t>
       </w:r>
     </w:p>
     <w:p>
@@ -244,35 +196,33 @@
           <w:color w:val="111827"/>
           <w:sz w:val="20"/>
         </w:rPr>
-        <w:t>Printing Press ERP / Business Management System | React, Supabase, JavaScript, Vite</w:t>
+        <w:t>Timber CFT Pro with Billing | React, JavaScript, Vite</w:t>
       </w:r>
     </w:p>
     <w:p>
       <w:pPr>
-        <w:spacing w:after="40"/>
-        <w:ind w:left="317" w:hanging="173"/>
+        <w:pStyle w:val="ListBullet"/>
       </w:pPr>
       <w:r>
         <w:rPr>
           <w:rFonts w:ascii="Arial" w:hAnsi="Arial" w:eastAsia="Arial"/>
           <w:color w:val="111827"/>
-          <w:sz w:val="20"/>
+          <w:sz w:val="18"/>
         </w:rPr>
-        <w:t>- Built and deployed React/Supabase business software screens for printing press workflows, dashboards, and operational tracking.</w:t>
+        <w:t>Converted supplied timber rules into browser-local CFT, ICBM, and raw-millimetre M3 calculations with CFT/M3 pricing, discount, GST, payments, balance/change, strict validation, local history, reopen, and print/Save PDF.</w:t>
       </w:r>
     </w:p>
     <w:p>
       <w:pPr>
-        <w:spacing w:after="40"/>
-        <w:ind w:left="317" w:hanging="173"/>
+        <w:pStyle w:val="ListBullet"/>
       </w:pPr>
       <w:r>
         <w:rPr>
           <w:rFonts w:ascii="Arial" w:hAnsi="Arial" w:eastAsia="Arial"/>
           <w:color w:val="111827"/>
-          <w:sz w:val="20"/>
+          <w:sz w:val="18"/>
         </w:rPr>
-        <w:t>- Modeled local-business workflows including inventory, production tracking, order operations, and role-based access concepts.</w:t>
+        <w:t>Excluded imported client database files and verified preserved measurement and invoice rules with automated tests.</w:t>
       </w:r>
     </w:p>
     <w:p>
@@ -286,21 +236,20 @@
           <w:color w:val="111827"/>
           <w:sz w:val="20"/>
         </w:rPr>
-        <w:t>Portfolio Website | React, Vite, Framer Motion, GSAP</w:t>
+        <w:t>Applied Labs | React, JavaScript, Python/C artifact generation</w:t>
       </w:r>
     </w:p>
     <w:p>
       <w:pPr>
-        <w:spacing w:after="40"/>
-        <w:ind w:left="317" w:hanging="173"/>
+        <w:pStyle w:val="ListBullet"/>
       </w:pPr>
       <w:r>
         <w:rPr>
           <w:rFonts w:ascii="Arial" w:hAnsi="Arial" w:eastAsia="Arial"/>
           <w:color w:val="111827"/>
-          <w:sz w:val="20"/>
+          <w:sz w:val="18"/>
         </w:rPr>
-        <w:t>- Created a public developer portfolio and one-tap links page with project proof, resume links, GitHub, LinkedIn, live demos, and contact actions.</w:t>
+        <w:t>Built 30 certificate-connected prototypes across five categories. Selected evidence includes CSV Claim Stress Tester, Detection Contract Drift Guard, Feature Misuse Contract, and Share-Link Afterlife Rehearsal; the full repository suite passes 151 automated tests.</w:t>
       </w:r>
     </w:p>
     <w:p>
@@ -313,35 +262,34 @@
     </w:p>
     <w:p>
       <w:pPr>
-        <w:spacing w:after="40"/>
-        <w:ind w:left="317" w:hanging="173"/>
+        <w:spacing w:after="60" w:line="259" w:lineRule="auto"/>
+      </w:pPr>
+      <w:r>
+        <w:rPr>
+          <w:rFonts w:ascii="Arial" w:hAnsi="Arial" w:eastAsia="Arial"/>
+          <w:b/>
+          <w:color w:val="111827"/>
+          <w:sz w:val="20"/>
+        </w:rPr>
+        <w:t>B.Sc. Computer Science with Artificial Intelligence, Rathinam Global University, Coimbatore - Expected 2028 | Semester 3 | CGPA 8.0</w:t>
+      </w:r>
+    </w:p>
+    <w:p>
+      <w:pPr>
+        <w:pStyle w:val="ListBullet"/>
       </w:pPr>
       <w:r>
         <w:rPr>
           <w:rFonts w:ascii="Arial" w:hAnsi="Arial" w:eastAsia="Arial"/>
           <w:color w:val="111827"/>
-          <w:sz w:val="20"/>
+          <w:sz w:val="18"/>
         </w:rPr>
-        <w:t>- B.Sc. Computer Science with Artificial Intelligence, Rathinam Global University, Coimbatore - 2028</w:t>
-      </w:r>
-    </w:p>
-    <w:p>
-      <w:pPr>
-        <w:spacing w:after="40"/>
-        <w:ind w:left="317" w:hanging="173"/>
-      </w:pPr>
-      <w:r>
-        <w:rPr>
-          <w:rFonts w:ascii="Arial" w:hAnsi="Arial" w:eastAsia="Arial"/>
-          <w:color w:val="111827"/>
-          <w:sz w:val="20"/>
-        </w:rPr>
-        <w:t>- Relevant coursework: Artificial Intelligence, Programming, Data Structures, Web Development, Database Systems</w:t>
+        <w:t>Relevant coursework: Artificial Intelligence, Programming, Data Structures, Web Development, Database Systems</w:t>
       </w:r>
     </w:p>
     <w:sectPr>
       <w:pgSz w:w="12240" w:h="15840"/>
-      <w:pgMar w:top="936" w:right="1037" w:bottom="936" w:left="1037" w:header="720" w:footer="720" w:gutter="0"/>
+      <w:pgMar w:top="835" w:right="979" w:bottom="835" w:left="979" w:header="432" w:footer="432" w:gutter="0"/>
       <w:cols w:space="720"/>
       <w:docGrid w:linePitch="360"/>
     </w:sectPr>
@@ -713,11 +661,11 @@
     <w:qFormat/>
     <w:rsid w:val="00FC693F"/>
     <w:pPr>
-      <w:spacing w:after="60" w:line="259" w:lineRule="auto"/>
+      <w:spacing w:after="50" w:line="250" w:lineRule="auto"/>
     </w:pPr>
     <w:rPr>
       <w:rFonts w:ascii="Arial" w:hAnsi="Arial" w:eastAsia="Arial"/>
-      <w:sz w:val="20"/>
+      <w:sz w:val="18"/>
     </w:rPr>
   </w:style>
   <w:style w:type="paragraph" w:styleId="Header">
@@ -775,15 +723,15 @@
     <w:pPr>
       <w:keepNext/>
       <w:keepLines/>
-      <w:spacing w:before="160" w:after="60"/>
+      <w:spacing w:before="120" w:after="50"/>
       <w:outlineLvl w:val="0"/>
     </w:pPr>
     <w:rPr>
       <w:rFonts w:asciiTheme="majorHAnsi" w:eastAsiaTheme="majorEastAsia" w:hAnsiTheme="majorHAnsi" w:cstheme="majorBidi" w:ascii="Arial" w:hAnsi="Arial" w:eastAsia="Arial"/>
       <w:b/>
       <w:bCs/>
-      <w:color w:val="0F766E"/>
-      <w:sz w:val="26"/>
+      <w:color w:val="1E4A37"/>
+      <w:sz w:val="24"/>
       <w:szCs w:val="28"/>
     </w:rPr>
   </w:style>
@@ -799,7 +747,7 @@
     <w:pPr>
       <w:keepNext/>
       <w:keepLines/>
-      <w:spacing w:before="160" w:after="60"/>
+      <w:spacing w:before="120" w:after="50"/>
       <w:outlineLvl w:val="1"/>
     </w:pPr>
     <w:rPr>
@@ -1246,8 +1194,14 @@
       <w:numPr>
         <w:numId w:val="1"/>
       </w:numPr>
+      <w:spacing w:after="36" w:line="247" w:lineRule="auto"/>
+      <w:ind w:left="346" w:hanging="202"/>
       <w:contextualSpacing/>
     </w:pPr>
+    <w:rPr>
+      <w:rFonts w:ascii="Arial" w:hAnsi="Arial" w:eastAsia="Arial"/>
+      <w:sz w:val="18"/>
+    </w:rPr>
   </w:style>
   <w:style w:type="paragraph" w:styleId="ListBullet2">
     <w:name w:val="List Bullet 2"/>

</xml_diff>